<commit_message>
Update Self Balancing Robot v2.docx
Added some items to BOM and chassis dimensions
</commit_message>
<xml_diff>
--- a/Self-Balancing Robot/Self Balancing Robot v2.docx
+++ b/Self-Balancing Robot/Self Balancing Robot v2.docx
@@ -2603,39 +2603,13 @@
         <w:rPr>
           <w:lang w:val="en-GB"/>
         </w:rPr>
-        <w:t>Will try and use breadboard and Arduino together directly connected to motors.</w:t>
-      </w:r>
-      <w:r>
-        <w:rPr>
-          <w:lang w:val="en-GB"/>
-        </w:rPr>
-        <w:t xml:space="preserve"> </w:t>
-      </w:r>
-      <w:r>
-        <w:rPr>
-          <w:lang w:val="en-GB"/>
-        </w:rPr>
-        <w:t>Possibly both need to be put on small wooden board.</w:t>
-      </w:r>
-    </w:p>
-    <w:p>
-      <w:pPr>
-        <w:tabs>
-          <w:tab w:val="left" w:pos="2680"/>
-        </w:tabs>
-        <w:rPr>
-          <w:b/>
-          <w:bCs/>
-          <w:lang w:val="en-GB"/>
-        </w:rPr>
-      </w:pPr>
-      <w:r>
-        <w:rPr>
-          <w:b/>
-          <w:bCs/>
-          <w:lang w:val="en-GB"/>
-        </w:rPr>
-        <w:t>Battery</w:t>
+        <w:t>Wood</w:t>
+      </w:r>
+      <w:r>
+        <w:rPr>
+          <w:lang w:val="en-GB"/>
+        </w:rPr>
+        <w:t>?</w:t>
       </w:r>
     </w:p>
     <w:p>
@@ -2656,6 +2630,183 @@
         <w:rPr>
           <w:lang w:val="en-GB"/>
         </w:rPr>
+        <w:t xml:space="preserve">Wooden boards should be approximately </w:t>
+      </w:r>
+      <w:r>
+        <w:rPr>
+          <w:lang w:val="en-GB"/>
+        </w:rPr>
+        <w:t>70</w:t>
+      </w:r>
+      <w:r>
+        <w:rPr>
+          <w:lang w:val="en-GB"/>
+        </w:rPr>
+        <w:t xml:space="preserve"> </w:t>
+      </w:r>
+      <w:r>
+        <w:rPr>
+          <w:lang w:val="en-GB"/>
+        </w:rPr>
+        <w:t xml:space="preserve">mm x </w:t>
+      </w:r>
+      <w:r>
+        <w:rPr>
+          <w:lang w:val="en-GB"/>
+        </w:rPr>
+        <w:t>110</w:t>
+      </w:r>
+      <w:r>
+        <w:rPr>
+          <w:lang w:val="en-GB"/>
+        </w:rPr>
+        <w:t xml:space="preserve"> </w:t>
+      </w:r>
+      <w:r>
+        <w:rPr>
+          <w:lang w:val="en-GB"/>
+        </w:rPr>
+        <w:t>mm x</w:t>
+      </w:r>
+      <w:r>
+        <w:rPr>
+          <w:lang w:val="en-GB"/>
+        </w:rPr>
+        <w:t xml:space="preserve"> 3</w:t>
+      </w:r>
+      <w:r>
+        <w:rPr>
+          <w:lang w:val="en-GB"/>
+        </w:rPr>
+        <w:t xml:space="preserve"> </w:t>
+      </w:r>
+      <w:r>
+        <w:rPr>
+          <w:lang w:val="en-GB"/>
+        </w:rPr>
+        <w:t>mm.</w:t>
+      </w:r>
+    </w:p>
+    <w:p>
+      <w:pPr>
+        <w:pStyle w:val="ListParagraph"/>
+        <w:numPr>
+          <w:ilvl w:val="0"/>
+          <w:numId w:val="4"/>
+        </w:numPr>
+        <w:tabs>
+          <w:tab w:val="left" w:pos="2680"/>
+        </w:tabs>
+        <w:rPr>
+          <w:lang w:val="en-GB"/>
+        </w:rPr>
+      </w:pPr>
+      <w:r>
+        <w:rPr>
+          <w:lang w:val="en-GB"/>
+        </w:rPr>
+        <w:t>Will need dowels to hold the different levels</w:t>
+      </w:r>
+      <w:r>
+        <w:rPr>
+          <w:lang w:val="en-GB"/>
+        </w:rPr>
+        <w:t>. These should be 6</w:t>
+      </w:r>
+      <w:r>
+        <w:rPr>
+          <w:lang w:val="en-GB"/>
+        </w:rPr>
+        <w:t xml:space="preserve"> </w:t>
+      </w:r>
+      <w:r>
+        <w:rPr>
+          <w:lang w:val="en-GB"/>
+        </w:rPr>
+        <w:t>mm in diameter</w:t>
+      </w:r>
+      <w:r>
+        <w:rPr>
+          <w:lang w:val="en-GB"/>
+        </w:rPr>
+        <w:t xml:space="preserve"> (or less) </w:t>
+      </w:r>
+      <w:r>
+        <w:rPr>
+          <w:lang w:val="en-GB"/>
+        </w:rPr>
+        <w:t>and</w:t>
+      </w:r>
+      <w:r>
+        <w:rPr>
+          <w:lang w:val="en-GB"/>
+        </w:rPr>
+        <w:t xml:space="preserve"> 50 mm to</w:t>
+      </w:r>
+      <w:r>
+        <w:rPr>
+          <w:lang w:val="en-GB"/>
+        </w:rPr>
+        <w:t xml:space="preserve"> </w:t>
+      </w:r>
+      <w:r>
+        <w:rPr>
+          <w:lang w:val="en-GB"/>
+        </w:rPr>
+        <w:t>60</w:t>
+      </w:r>
+      <w:r>
+        <w:rPr>
+          <w:lang w:val="en-GB"/>
+        </w:rPr>
+        <w:t xml:space="preserve"> mm high</w:t>
+      </w:r>
+      <w:r>
+        <w:rPr>
+          <w:lang w:val="en-GB"/>
+        </w:rPr>
+        <w:t>.</w:t>
+      </w:r>
+    </w:p>
+    <w:p>
+      <w:pPr>
+        <w:tabs>
+          <w:tab w:val="left" w:pos="2680"/>
+        </w:tabs>
+        <w:rPr>
+          <w:b/>
+          <w:bCs/>
+          <w:lang w:val="en-GB"/>
+        </w:rPr>
+      </w:pPr>
+      <w:r>
+        <w:rPr>
+          <w:b/>
+          <w:bCs/>
+          <w:lang w:val="en-GB"/>
+        </w:rPr>
+        <w:t>Battery</w:t>
+      </w:r>
+    </w:p>
+    <w:p>
+      <w:pPr>
+        <w:pStyle w:val="ListParagraph"/>
+        <w:numPr>
+          <w:ilvl w:val="0"/>
+          <w:numId w:val="4"/>
+        </w:numPr>
+        <w:tabs>
+          <w:tab w:val="left" w:pos="2680"/>
+        </w:tabs>
+        <w:rPr>
+          <w:lang w:val="en-GB"/>
+        </w:rPr>
+      </w:pPr>
+      <w:r>
+        <w:rPr>
+          <w:lang w:val="en-GB"/>
+        </w:rPr>
+        <w:lastRenderedPageBreak/>
         <w:t>C</w:t>
       </w:r>
       <w:r>
@@ -6284,19 +6435,119 @@
                 <w:rPr>
                   <w:rStyle w:val="Hyperlink"/>
                 </w:rPr>
-                <w:t>DigiK</w:t>
+                <w:t>DigiKey</w:t>
               </w:r>
+            </w:hyperlink>
+          </w:p>
+        </w:tc>
+      </w:tr>
+      <w:tr>
+        <w:tc>
+          <w:tcPr>
+            <w:tcW w:w="2173" w:type="dxa"/>
+          </w:tcPr>
+          <w:p>
+            <w:pPr>
+              <w:tabs>
+                <w:tab w:val="left" w:pos="2680"/>
+              </w:tabs>
+              <w:rPr>
+                <w:lang w:val="en-GB"/>
+              </w:rPr>
+            </w:pPr>
+            <w:r>
+              <w:rPr>
+                <w:lang w:val="en-GB"/>
+              </w:rPr>
+              <w:t>Vero Board</w:t>
+            </w:r>
+          </w:p>
+        </w:tc>
+        <w:tc>
+          <w:tcPr>
+            <w:tcW w:w="1774" w:type="dxa"/>
+          </w:tcPr>
+          <w:p>
+            <w:pPr>
+              <w:tabs>
+                <w:tab w:val="left" w:pos="2680"/>
+              </w:tabs>
+              <w:rPr>
+                <w:lang w:val="en-GB"/>
+              </w:rPr>
+            </w:pPr>
+            <w:r>
+              <w:rPr>
+                <w:lang w:val="en-GB"/>
+              </w:rPr>
+              <w:t>R</w:t>
+            </w:r>
+            <w:r>
+              <w:rPr>
+                <w:lang w:val="en-GB"/>
+              </w:rPr>
+              <w:t>57.26</w:t>
+            </w:r>
+          </w:p>
+        </w:tc>
+        <w:tc>
+          <w:tcPr>
+            <w:tcW w:w="1778" w:type="dxa"/>
+          </w:tcPr>
+          <w:p>
+            <w:pPr>
+              <w:tabs>
+                <w:tab w:val="left" w:pos="2680"/>
+              </w:tabs>
+              <w:rPr>
+                <w:lang w:val="en-GB"/>
+              </w:rPr>
+            </w:pPr>
+            <w:r>
+              <w:rPr>
+                <w:lang w:val="en-GB"/>
+              </w:rPr>
+              <w:t>1</w:t>
+            </w:r>
+          </w:p>
+        </w:tc>
+        <w:tc>
+          <w:tcPr>
+            <w:tcW w:w="1573" w:type="dxa"/>
+          </w:tcPr>
+          <w:p>
+            <w:pPr>
+              <w:tabs>
+                <w:tab w:val="left" w:pos="2680"/>
+              </w:tabs>
+              <w:rPr>
+                <w:lang w:val="en-GB"/>
+              </w:rPr>
+            </w:pPr>
+            <w:r>
+              <w:rPr>
+                <w:lang w:val="en-GB"/>
+              </w:rPr>
+              <w:t>R57.26</w:t>
+            </w:r>
+          </w:p>
+        </w:tc>
+        <w:tc>
+          <w:tcPr>
+            <w:tcW w:w="1718" w:type="dxa"/>
+          </w:tcPr>
+          <w:p>
+            <w:pPr>
+              <w:tabs>
+                <w:tab w:val="left" w:pos="2680"/>
+              </w:tabs>
+            </w:pPr>
+            <w:hyperlink r:id="rId41" w:history="1">
               <w:r>
                 <w:rPr>
                   <w:rStyle w:val="Hyperlink"/>
                 </w:rPr>
-                <w:t>e</w:t>
-              </w:r>
-              <w:r>
-                <w:rPr>
-                  <w:rStyle w:val="Hyperlink"/>
-                </w:rPr>
-                <w:t>y</w:t>
+                <w:t>DigiKey</w:t>
               </w:r>
             </w:hyperlink>
           </w:p>
@@ -6350,7 +6601,7 @@
                 <w:bCs/>
                 <w:lang w:val="en-GB"/>
               </w:rPr>
-              <w:t>R2</w:t>
+              <w:t>R</w:t>
             </w:r>
             <w:r>
               <w:rPr>
@@ -6358,7 +6609,7 @@
                 <w:bCs/>
                 <w:lang w:val="en-GB"/>
               </w:rPr>
-              <w:t>27.45</w:t>
+              <w:t>422.15</w:t>
             </w:r>
           </w:p>
         </w:tc>
@@ -6457,121 +6708,6 @@
               <w:tabs>
                 <w:tab w:val="left" w:pos="2680"/>
               </w:tabs>
-              <w:rPr>
-                <w:lang w:val="en-GB"/>
-              </w:rPr>
-            </w:pPr>
-            <w:hyperlink r:id="rId41" w:history="1">
-              <w:r>
-                <w:rPr>
-                  <w:rStyle w:val="Hyperlink"/>
-                  <w:lang w:val="en-GB"/>
-                </w:rPr>
-                <w:t>Microrobotics</w:t>
-              </w:r>
-            </w:hyperlink>
-          </w:p>
-        </w:tc>
-      </w:tr>
-      <w:tr>
-        <w:tc>
-          <w:tcPr>
-            <w:tcW w:w="2173" w:type="dxa"/>
-          </w:tcPr>
-          <w:p>
-            <w:pPr>
-              <w:tabs>
-                <w:tab w:val="left" w:pos="2680"/>
-              </w:tabs>
-              <w:jc w:val="both"/>
-              <w:rPr>
-                <w:lang w:val="en-GB"/>
-              </w:rPr>
-            </w:pPr>
-            <w:r>
-              <w:rPr>
-                <w:lang w:val="en-GB"/>
-              </w:rPr>
-              <w:t>Battery Charger</w:t>
-            </w:r>
-          </w:p>
-        </w:tc>
-        <w:tc>
-          <w:tcPr>
-            <w:tcW w:w="1774" w:type="dxa"/>
-          </w:tcPr>
-          <w:p>
-            <w:pPr>
-              <w:tabs>
-                <w:tab w:val="left" w:pos="2680"/>
-              </w:tabs>
-              <w:jc w:val="both"/>
-              <w:rPr>
-                <w:lang w:val="en-GB"/>
-              </w:rPr>
-            </w:pPr>
-            <w:r>
-              <w:rPr>
-                <w:lang w:val="en-GB"/>
-              </w:rPr>
-              <w:t>R109</w:t>
-            </w:r>
-          </w:p>
-        </w:tc>
-        <w:tc>
-          <w:tcPr>
-            <w:tcW w:w="1778" w:type="dxa"/>
-          </w:tcPr>
-          <w:p>
-            <w:pPr>
-              <w:tabs>
-                <w:tab w:val="left" w:pos="2680"/>
-              </w:tabs>
-              <w:jc w:val="both"/>
-              <w:rPr>
-                <w:lang w:val="en-GB"/>
-              </w:rPr>
-            </w:pPr>
-            <w:r>
-              <w:rPr>
-                <w:lang w:val="en-GB"/>
-              </w:rPr>
-              <w:t>1</w:t>
-            </w:r>
-          </w:p>
-        </w:tc>
-        <w:tc>
-          <w:tcPr>
-            <w:tcW w:w="1573" w:type="dxa"/>
-          </w:tcPr>
-          <w:p>
-            <w:pPr>
-              <w:tabs>
-                <w:tab w:val="left" w:pos="2680"/>
-              </w:tabs>
-              <w:jc w:val="both"/>
-              <w:rPr>
-                <w:lang w:val="en-GB"/>
-              </w:rPr>
-            </w:pPr>
-            <w:r>
-              <w:rPr>
-                <w:lang w:val="en-GB"/>
-              </w:rPr>
-              <w:t>R109</w:t>
-            </w:r>
-          </w:p>
-        </w:tc>
-        <w:tc>
-          <w:tcPr>
-            <w:tcW w:w="1718" w:type="dxa"/>
-          </w:tcPr>
-          <w:p>
-            <w:pPr>
-              <w:tabs>
-                <w:tab w:val="left" w:pos="2680"/>
-              </w:tabs>
-              <w:jc w:val="both"/>
               <w:rPr>
                 <w:lang w:val="en-GB"/>
               </w:rPr>
@@ -6607,7 +6743,7 @@
               <w:rPr>
                 <w:lang w:val="en-GB"/>
               </w:rPr>
-              <w:t>Potentiometer</w:t>
+              <w:t>Battery Charger</w:t>
             </w:r>
           </w:p>
         </w:tc>
@@ -6629,7 +6765,7 @@
               <w:rPr>
                 <w:lang w:val="en-GB"/>
               </w:rPr>
-              <w:t>R23</w:t>
+              <w:t>R109</w:t>
             </w:r>
           </w:p>
         </w:tc>
@@ -6673,7 +6809,7 @@
               <w:rPr>
                 <w:lang w:val="en-GB"/>
               </w:rPr>
-              <w:t>R23</w:t>
+              <w:t>R109</w:t>
             </w:r>
           </w:p>
         </w:tc>
@@ -6687,11 +6823,15 @@
                 <w:tab w:val="left" w:pos="2680"/>
               </w:tabs>
               <w:jc w:val="both"/>
+              <w:rPr>
+                <w:lang w:val="en-GB"/>
+              </w:rPr>
             </w:pPr>
             <w:hyperlink r:id="rId43" w:history="1">
               <w:r>
                 <w:rPr>
                   <w:rStyle w:val="Hyperlink"/>
+                  <w:lang w:val="en-GB"/>
                 </w:rPr>
                 <w:t>Microrobotics</w:t>
               </w:r>
@@ -6718,7 +6858,7 @@
               <w:rPr>
                 <w:lang w:val="en-GB"/>
               </w:rPr>
-              <w:t>Switch</w:t>
+              <w:t>Potentiometer</w:t>
             </w:r>
           </w:p>
         </w:tc>
@@ -6740,7 +6880,7 @@
               <w:rPr>
                 <w:lang w:val="en-GB"/>
               </w:rPr>
-              <w:t>R16.10</w:t>
+              <w:t>R23</w:t>
             </w:r>
           </w:p>
         </w:tc>
@@ -6784,7 +6924,7 @@
               <w:rPr>
                 <w:lang w:val="en-GB"/>
               </w:rPr>
-              <w:t>R16.10</w:t>
+              <w:t>R23</w:t>
             </w:r>
           </w:p>
         </w:tc>
@@ -6813,6 +6953,117 @@
       <w:tr>
         <w:tc>
           <w:tcPr>
+            <w:tcW w:w="2173" w:type="dxa"/>
+          </w:tcPr>
+          <w:p>
+            <w:pPr>
+              <w:tabs>
+                <w:tab w:val="left" w:pos="2680"/>
+              </w:tabs>
+              <w:jc w:val="both"/>
+              <w:rPr>
+                <w:lang w:val="en-GB"/>
+              </w:rPr>
+            </w:pPr>
+            <w:r>
+              <w:rPr>
+                <w:lang w:val="en-GB"/>
+              </w:rPr>
+              <w:t>Switch</w:t>
+            </w:r>
+          </w:p>
+        </w:tc>
+        <w:tc>
+          <w:tcPr>
+            <w:tcW w:w="1774" w:type="dxa"/>
+          </w:tcPr>
+          <w:p>
+            <w:pPr>
+              <w:tabs>
+                <w:tab w:val="left" w:pos="2680"/>
+              </w:tabs>
+              <w:jc w:val="both"/>
+              <w:rPr>
+                <w:lang w:val="en-GB"/>
+              </w:rPr>
+            </w:pPr>
+            <w:r>
+              <w:rPr>
+                <w:lang w:val="en-GB"/>
+              </w:rPr>
+              <w:t>R16.10</w:t>
+            </w:r>
+          </w:p>
+        </w:tc>
+        <w:tc>
+          <w:tcPr>
+            <w:tcW w:w="1778" w:type="dxa"/>
+          </w:tcPr>
+          <w:p>
+            <w:pPr>
+              <w:tabs>
+                <w:tab w:val="left" w:pos="2680"/>
+              </w:tabs>
+              <w:jc w:val="both"/>
+              <w:rPr>
+                <w:lang w:val="en-GB"/>
+              </w:rPr>
+            </w:pPr>
+            <w:r>
+              <w:rPr>
+                <w:lang w:val="en-GB"/>
+              </w:rPr>
+              <w:t>1</w:t>
+            </w:r>
+          </w:p>
+        </w:tc>
+        <w:tc>
+          <w:tcPr>
+            <w:tcW w:w="1573" w:type="dxa"/>
+          </w:tcPr>
+          <w:p>
+            <w:pPr>
+              <w:tabs>
+                <w:tab w:val="left" w:pos="2680"/>
+              </w:tabs>
+              <w:jc w:val="both"/>
+              <w:rPr>
+                <w:lang w:val="en-GB"/>
+              </w:rPr>
+            </w:pPr>
+            <w:r>
+              <w:rPr>
+                <w:lang w:val="en-GB"/>
+              </w:rPr>
+              <w:t>R16.10</w:t>
+            </w:r>
+          </w:p>
+        </w:tc>
+        <w:tc>
+          <w:tcPr>
+            <w:tcW w:w="1718" w:type="dxa"/>
+          </w:tcPr>
+          <w:p>
+            <w:pPr>
+              <w:tabs>
+                <w:tab w:val="left" w:pos="2680"/>
+              </w:tabs>
+              <w:jc w:val="both"/>
+            </w:pPr>
+            <w:hyperlink r:id="rId45" w:history="1">
+              <w:r>
+                <w:rPr>
+                  <w:rStyle w:val="Hyperlink"/>
+                </w:rPr>
+                <w:t>Microrobotics</w:t>
+              </w:r>
+            </w:hyperlink>
+          </w:p>
+        </w:tc>
+      </w:tr>
+      <w:tr>
+        <w:tc>
+          <w:tcPr>
             <w:tcW w:w="5725" w:type="dxa"/>
             <w:gridSpan w:val="3"/>
           </w:tcPr>
@@ -6915,7 +7166,7 @@
                 <w:bCs/>
                 <w:lang w:val="en-GB"/>
               </w:rPr>
-              <w:t>R726.98</w:t>
+              <w:t>R</w:t>
             </w:r>
           </w:p>
         </w:tc>
@@ -7121,7 +7372,7 @@
           <w:lang w:val="en-GB"/>
         </w:rPr>
       </w:pPr>
-      <w:hyperlink r:id="rId45" w:history="1">
+      <w:hyperlink r:id="rId46" w:history="1">
         <w:r>
           <w:rPr>
             <w:rStyle w:val="Hyperlink"/>
@@ -7169,6 +7420,7 @@
         <w:rPr>
           <w:lang w:val="en-GB"/>
         </w:rPr>
+        <w:lastRenderedPageBreak/>
         <w:t>analogWrite(pin, value)</w:t>
       </w:r>
     </w:p>
@@ -7187,7 +7439,6 @@
         <w:rPr>
           <w:lang w:val="en-GB"/>
         </w:rPr>
-        <w:lastRenderedPageBreak/>
         <w:t>Pin must be a PWM-capable pin (marked with ~ symbol)</w:t>
       </w:r>
     </w:p>

</xml_diff>